<commit_message>
suppression d'un detal dans le template etudiant
</commit_message>
<xml_diff>
--- a/templates/template_etudiants.docx
+++ b/templates/template_etudiants.docx
@@ -9,6 +9,9 @@
         </w:tabs>
       </w:pPr>
       <w:r>
+        <w:rPr>
+          <w:noProof/>
+        </w:rPr>
         <mc:AlternateContent>
           <mc:Choice Requires="wps">
             <w:drawing>
@@ -86,6 +89,9 @@
         </mc:AlternateContent>
       </w:r>
       <w:r>
+        <w:rPr>
+          <w:noProof/>
+        </w:rPr>
         <mc:AlternateContent>
           <mc:Choice Requires="wps">
             <w:drawing>
@@ -191,6 +197,9 @@
         </mc:AlternateContent>
       </w:r>
       <w:r>
+        <w:rPr>
+          <w:noProof/>
+        </w:rPr>
         <mc:AlternateContent>
           <mc:Choice Requires="wpg">
             <w:drawing>
@@ -341,6 +350,9 @@
         </mc:AlternateContent>
       </w:r>
       <w:r>
+        <w:rPr>
+          <w:noProof/>
+        </w:rPr>
         <mc:AlternateContent>
           <mc:Choice Requires="wpg">
             <w:drawing>
@@ -491,6 +503,9 @@
         </mc:AlternateContent>
       </w:r>
       <w:r>
+        <w:rPr>
+          <w:noProof/>
+        </w:rPr>
         <mc:AlternateContent>
           <mc:Choice Requires="wpg">
             <w:drawing>
@@ -641,6 +656,9 @@
         </mc:AlternateContent>
       </w:r>
       <w:r>
+        <w:rPr>
+          <w:noProof/>
+        </w:rPr>
         <mc:AlternateContent>
           <mc:Choice Requires="wpg">
             <w:drawing>
@@ -791,6 +809,9 @@
         </mc:AlternateContent>
       </w:r>
       <w:r>
+        <w:rPr>
+          <w:noProof/>
+        </w:rPr>
         <mc:AlternateContent>
           <mc:Choice Requires="wps">
             <w:drawing>
@@ -847,7 +868,7 @@
                           <a:blip r:embed="rId8">
                             <a:extLst>
                               <a:ext uri="{96DAC541-7B7A-43D3-8B79-37D633B846F1}">
-                                <asvg:svgBlip xmlns:lc="http://schemas.openxmlformats.org/drawingml/2006/lockedCanvas" xmlns:asvg="http://schemas.microsoft.com/office/drawing/2016/SVG/main" xmlns:p="http://schemas.openxmlformats.org/presentationml/2006/main" xmlns="" xmlns:w="http://schemas.openxmlformats.org/wordprocessingml/2006/main" xmlns:w10="urn:schemas-microsoft-com:office:word" xmlns:v="urn:schemas-microsoft-com:vml" xmlns:o="urn:schemas-microsoft-com:office:office" r:embed="rId9"/>
+                                <asvg:svgBlip xmlns:o="urn:schemas-microsoft-com:office:office" xmlns:v="urn:schemas-microsoft-com:vml" xmlns:w10="urn:schemas-microsoft-com:office:word" xmlns:w="http://schemas.openxmlformats.org/wordprocessingml/2006/main" xmlns="" xmlns:p="http://schemas.openxmlformats.org/presentationml/2006/main" xmlns:asvg="http://schemas.microsoft.com/office/drawing/2016/SVG/main" xmlns:lc="http://schemas.openxmlformats.org/drawingml/2006/lockedCanvas" r:embed="rId9"/>
                               </a:ext>
                             </a:extLst>
                           </a:blip>
@@ -874,6 +895,9 @@
         </mc:AlternateContent>
       </w:r>
       <w:r>
+        <w:rPr>
+          <w:noProof/>
+        </w:rPr>
         <mc:AlternateContent>
           <mc:Choice Requires="wps">
             <w:drawing>
@@ -930,7 +954,7 @@
                           <a:blip r:embed="rId8">
                             <a:extLst>
                               <a:ext uri="{96DAC541-7B7A-43D3-8B79-37D633B846F1}">
-                                <asvg:svgBlip xmlns:lc="http://schemas.openxmlformats.org/drawingml/2006/lockedCanvas" xmlns:asvg="http://schemas.microsoft.com/office/drawing/2016/SVG/main" xmlns:p="http://schemas.openxmlformats.org/presentationml/2006/main" xmlns="" xmlns:w="http://schemas.openxmlformats.org/wordprocessingml/2006/main" xmlns:w10="urn:schemas-microsoft-com:office:word" xmlns:v="urn:schemas-microsoft-com:vml" xmlns:o="urn:schemas-microsoft-com:office:office" r:embed="rId9"/>
+                                <asvg:svgBlip xmlns:o="urn:schemas-microsoft-com:office:office" xmlns:v="urn:schemas-microsoft-com:vml" xmlns:w10="urn:schemas-microsoft-com:office:word" xmlns:w="http://schemas.openxmlformats.org/wordprocessingml/2006/main" xmlns="" xmlns:p="http://schemas.openxmlformats.org/presentationml/2006/main" xmlns:asvg="http://schemas.microsoft.com/office/drawing/2016/SVG/main" xmlns:lc="http://schemas.openxmlformats.org/drawingml/2006/lockedCanvas" r:embed="rId9"/>
                               </a:ext>
                             </a:extLst>
                           </a:blip>
@@ -957,6 +981,9 @@
         </mc:AlternateContent>
       </w:r>
       <w:r>
+        <w:rPr>
+          <w:noProof/>
+        </w:rPr>
         <mc:AlternateContent>
           <mc:Choice Requires="wps">
             <w:drawing>
@@ -1013,7 +1040,7 @@
                           <a:blip r:embed="rId8">
                             <a:extLst>
                               <a:ext uri="{96DAC541-7B7A-43D3-8B79-37D633B846F1}">
-                                <asvg:svgBlip xmlns:lc="http://schemas.openxmlformats.org/drawingml/2006/lockedCanvas" xmlns:asvg="http://schemas.microsoft.com/office/drawing/2016/SVG/main" xmlns:p="http://schemas.openxmlformats.org/presentationml/2006/main" xmlns="" xmlns:w="http://schemas.openxmlformats.org/wordprocessingml/2006/main" xmlns:w10="urn:schemas-microsoft-com:office:word" xmlns:v="urn:schemas-microsoft-com:vml" xmlns:o="urn:schemas-microsoft-com:office:office" r:embed="rId9"/>
+                                <asvg:svgBlip xmlns:o="urn:schemas-microsoft-com:office:office" xmlns:v="urn:schemas-microsoft-com:vml" xmlns:w10="urn:schemas-microsoft-com:office:word" xmlns:w="http://schemas.openxmlformats.org/wordprocessingml/2006/main" xmlns="" xmlns:p="http://schemas.openxmlformats.org/presentationml/2006/main" xmlns:asvg="http://schemas.microsoft.com/office/drawing/2016/SVG/main" xmlns:lc="http://schemas.openxmlformats.org/drawingml/2006/lockedCanvas" r:embed="rId9"/>
                               </a:ext>
                             </a:extLst>
                           </a:blip>
@@ -1040,6 +1067,9 @@
         </mc:AlternateContent>
       </w:r>
       <w:r>
+        <w:rPr>
+          <w:noProof/>
+        </w:rPr>
         <mc:AlternateContent>
           <mc:Choice Requires="wps">
             <w:drawing>
@@ -1096,7 +1126,7 @@
                           <a:blip r:embed="rId8">
                             <a:extLst>
                               <a:ext uri="{96DAC541-7B7A-43D3-8B79-37D633B846F1}">
-                                <asvg:svgBlip xmlns:lc="http://schemas.openxmlformats.org/drawingml/2006/lockedCanvas" xmlns:asvg="http://schemas.microsoft.com/office/drawing/2016/SVG/main" xmlns:p="http://schemas.openxmlformats.org/presentationml/2006/main" xmlns="" xmlns:w="http://schemas.openxmlformats.org/wordprocessingml/2006/main" xmlns:w10="urn:schemas-microsoft-com:office:word" xmlns:v="urn:schemas-microsoft-com:vml" xmlns:o="urn:schemas-microsoft-com:office:office" r:embed="rId9"/>
+                                <asvg:svgBlip xmlns:o="urn:schemas-microsoft-com:office:office" xmlns:v="urn:schemas-microsoft-com:vml" xmlns:w10="urn:schemas-microsoft-com:office:word" xmlns:w="http://schemas.openxmlformats.org/wordprocessingml/2006/main" xmlns="" xmlns:p="http://schemas.openxmlformats.org/presentationml/2006/main" xmlns:asvg="http://schemas.microsoft.com/office/drawing/2016/SVG/main" xmlns:lc="http://schemas.openxmlformats.org/drawingml/2006/lockedCanvas" r:embed="rId9"/>
                               </a:ext>
                             </a:extLst>
                           </a:blip>
@@ -1128,6 +1158,9 @@
     </w:p>
     <w:p>
       <w:r>
+        <w:rPr>
+          <w:noProof/>
+        </w:rPr>
         <mc:AlternateContent>
           <mc:Choice Requires="wps">
             <w:drawing>
@@ -1233,6 +1266,9 @@
         </w:tabs>
       </w:pPr>
       <w:r>
+        <w:rPr>
+          <w:noProof/>
+        </w:rPr>
         <mc:AlternateContent>
           <mc:Choice Requires="wps">
             <w:drawing>
@@ -1309,6 +1345,9 @@
     </w:p>
     <w:p>
       <w:r>
+        <w:rPr>
+          <w:noProof/>
+        </w:rPr>
         <mc:AlternateContent>
           <mc:Choice Requires="wps">
             <w:drawing>
@@ -1416,6 +1455,9 @@
     </w:p>
     <w:p>
       <w:r>
+        <w:rPr>
+          <w:noProof/>
+        </w:rPr>
         <mc:AlternateContent>
           <mc:Choice Requires="wps">
             <w:drawing>
@@ -1612,29 +1654,7 @@
                                 <w:szCs w:val="38"/>
                                 <w:lang w:val="fr-FR"/>
                               </w:rPr>
-                              <w:t xml:space="preserve"> L’intéressé a achevé la formation et à composer un examen de Certificat de Qualification Professionnel (CQP) dont les résultats sont en attente de publication.  </w:t>
-                            </w:r>
-                          </w:p>
-                          <w:p>
-                            <w:pPr>
-                              <w:pStyle w:val="NormalWeb"/>
-                              <w:spacing w:before="0" w:beforeAutospacing="0" w:after="0" w:afterAutospacing="0" w:line="756" w:lineRule="exact"/>
-                              <w:jc w:val="center"/>
-                              <w:rPr>
-                                <w:lang w:val="fr-FR"/>
-                              </w:rPr>
-                            </w:pPr>
-                            <w:r>
-                              <w:rPr>
-                                <w:rFonts w:ascii="DawnoraTH" w:eastAsia="DawnoraTH" w:hAnsi="DawnoraTH" w:cs="DawnoraTH"/>
-                                <w:color w:val="152B6B"/>
-                                <w:spacing w:val="-8"/>
-                                <w:kern w:val="24"/>
-                                <w:sz w:val="38"/>
-                                <w:szCs w:val="38"/>
-                                <w:lang w:val="fr-FR"/>
-                              </w:rPr>
-                              <w:t>En foi de quoi, le présent document lui est délivré pour servir et valoir ce que de droit.</w:t>
+                              <w:t xml:space="preserve"> En foi de quoi, le présent document lui est délivré pour servir et valoir ce que de droit.</w:t>
                             </w:r>
                           </w:p>
                         </w:txbxContent>
@@ -1828,29 +1848,7 @@
                           <w:szCs w:val="38"/>
                           <w:lang w:val="fr-FR"/>
                         </w:rPr>
-                        <w:t xml:space="preserve"> L’intéressé a achevé la formation et à composer un examen de Certificat de Qualification Professionnel (CQP) dont les résultats sont en attente de publication.  </w:t>
-                      </w:r>
-                    </w:p>
-                    <w:p>
-                      <w:pPr>
-                        <w:pStyle w:val="NormalWeb"/>
-                        <w:spacing w:before="0" w:beforeAutospacing="0" w:after="0" w:afterAutospacing="0" w:line="756" w:lineRule="exact"/>
-                        <w:jc w:val="center"/>
-                        <w:rPr>
-                          <w:lang w:val="fr-FR"/>
-                        </w:rPr>
-                      </w:pPr>
-                      <w:r>
-                        <w:rPr>
-                          <w:rFonts w:ascii="DawnoraTH" w:eastAsia="DawnoraTH" w:hAnsi="DawnoraTH" w:cs="DawnoraTH"/>
-                          <w:color w:val="152B6B"/>
-                          <w:spacing w:val="-8"/>
-                          <w:kern w:val="24"/>
-                          <w:sz w:val="38"/>
-                          <w:szCs w:val="38"/>
-                          <w:lang w:val="fr-FR"/>
-                        </w:rPr>
-                        <w:t>En foi de quoi, le présent document lui est délivré pour servir et valoir ce que de droit.</w:t>
+                        <w:t xml:space="preserve"> En foi de quoi, le présent document lui est délivré pour servir et valoir ce que de droit.</w:t>
                       </w:r>
                     </w:p>
                   </w:txbxContent>
@@ -1877,14 +1875,14 @@
     <w:p/>
     <w:p/>
     <w:p/>
-    <w:p>
-      <w:bookmarkStart w:id="0" w:name="_GoBack"/>
-      <w:bookmarkEnd w:id="0"/>
-    </w:p>
+    <w:p/>
     <w:p/>
     <w:p/>
     <w:p>
       <w:r>
+        <w:rPr>
+          <w:noProof/>
+        </w:rPr>
         <mc:AlternateContent>
           <mc:Choice Requires="wps">
             <w:drawing>
@@ -1997,12 +1995,17 @@
           <w:tab w:val="left" w:pos="10030"/>
         </w:tabs>
       </w:pPr>
+      <w:bookmarkStart w:id="0" w:name="_GoBack"/>
+      <w:bookmarkEnd w:id="0"/>
       <w:r>
         <w:tab/>
       </w:r>
     </w:p>
     <w:p>
       <w:r>
+        <w:rPr>
+          <w:noProof/>
+        </w:rPr>
         <mc:AlternateContent>
           <mc:Choice Requires="wps">
             <w:drawing>
@@ -2098,6 +2101,9 @@
         </mc:AlternateContent>
       </w:r>
       <w:r>
+        <w:rPr>
+          <w:noProof/>
+        </w:rPr>
         <mc:AlternateContent>
           <mc:Choice Requires="wps">
             <w:drawing>
@@ -2154,7 +2160,7 @@
                           <a:blip r:embed="rId11">
                             <a:extLst>
                               <a:ext uri="{96DAC541-7B7A-43D3-8B79-37D633B846F1}">
-                                <asvg:svgBlip xmlns:lc="http://schemas.openxmlformats.org/drawingml/2006/lockedCanvas" xmlns:asvg="http://schemas.microsoft.com/office/drawing/2016/SVG/main" xmlns:p="http://schemas.openxmlformats.org/presentationml/2006/main" xmlns="" xmlns:w="http://schemas.openxmlformats.org/wordprocessingml/2006/main" xmlns:w10="urn:schemas-microsoft-com:office:word" xmlns:v="urn:schemas-microsoft-com:vml" xmlns:o="urn:schemas-microsoft-com:office:office" r:embed="rId12"/>
+                                <asvg:svgBlip xmlns:o="urn:schemas-microsoft-com:office:office" xmlns:v="urn:schemas-microsoft-com:vml" xmlns:w10="urn:schemas-microsoft-com:office:word" xmlns:w="http://schemas.openxmlformats.org/wordprocessingml/2006/main" xmlns="" xmlns:p="http://schemas.openxmlformats.org/presentationml/2006/main" xmlns:asvg="http://schemas.microsoft.com/office/drawing/2016/SVG/main" xmlns:lc="http://schemas.openxmlformats.org/drawingml/2006/lockedCanvas" r:embed="rId12"/>
                               </a:ext>
                             </a:extLst>
                           </a:blip>
@@ -2181,6 +2187,9 @@
         </mc:AlternateContent>
       </w:r>
       <w:r>
+        <w:rPr>
+          <w:noProof/>
+        </w:rPr>
         <mc:AlternateContent>
           <mc:Choice Requires="wps">
             <w:drawing>
@@ -2278,6 +2287,9 @@
         </w:tabs>
       </w:pPr>
       <w:r>
+        <w:rPr>
+          <w:noProof/>
+        </w:rPr>
         <mc:AlternateContent>
           <mc:Choice Requires="wps">
             <w:drawing>
@@ -2375,6 +2387,9 @@
         </w:tabs>
       </w:pPr>
       <w:r>
+        <w:rPr>
+          <w:noProof/>
+        </w:rPr>
         <mc:AlternateContent>
           <mc:Choice Requires="wps">
             <w:drawing>
@@ -3063,6 +3078,7 @@
   <w:style w:type="character" w:default="1" w:styleId="Policepardfaut">
     <w:name w:val="Default Paragraph Font"/>
     <w:uiPriority w:val="1"/>
+    <w:semiHidden/>
     <w:unhideWhenUsed/>
   </w:style>
   <w:style w:type="table" w:default="1" w:styleId="TableauNormal">

</xml_diff>